<commit_message>
refactor(audit-v3): implement reviewer corrections across notebooks 01-10, modularize cells, polish figures, and update audit artifacts
</commit_message>
<xml_diff>
--- a/reports/TaniAdapt_Comprehensive_EDA_Dossier.docx
+++ b/reports/TaniAdapt_Comprehensive_EDA_Dossier.docx
@@ -1750,7 +1750,7 @@
       <w:r>
         <w:drawing>
           <wp:inline xmlns:a="http://schemas.openxmlformats.org/drawingml/2006/main" xmlns:pic="http://schemas.openxmlformats.org/drawingml/2006/picture">
-            <wp:extent cx="5303520" cy="2372627"/>
+            <wp:extent cx="5303520" cy="2521711"/>
             <wp:docPr id="1" name="Picture 1"/>
             <wp:cNvGraphicFramePr>
               <a:graphicFrameLocks noChangeAspect="1"/>
@@ -1771,7 +1771,7 @@
                   <pic:spPr>
                     <a:xfrm>
                       <a:off x="0" y="0"/>
-                      <a:ext cx="5303520" cy="2372627"/>
+                      <a:ext cx="5303520" cy="2521711"/>
                     </a:xfrm>
                     <a:prstGeom prst="rect"/>
                   </pic:spPr>
@@ -1972,7 +1972,7 @@
         <w:spacing w:after="160"/>
       </w:pPr>
       <w:r>
-        <w:t>Gambar 4.4: Komparasi Padi Sawah vs Padi Ladang (Lonjakan Serempak 2019 Terjadi pada Kedua Sub-Sektor, Membuktikan Galat Konversi Dinas).</w:t>
+        <w:t>Gambar 4.4: Komparasi Padi Sawah vs Padi Ladang (Lonjakan Administratif Serentak 2019: Sawah +23%, Ladang +55%, Penyebab Belum Diketahui).</w:t>
       </w:r>
     </w:p>
     <w:p>
@@ -2461,7 +2461,7 @@
       <w:r>
         <w:drawing>
           <wp:inline xmlns:a="http://schemas.openxmlformats.org/drawingml/2006/main" xmlns:pic="http://schemas.openxmlformats.org/drawingml/2006/picture">
-            <wp:extent cx="5303520" cy="2263579"/>
+            <wp:extent cx="5303520" cy="2289766"/>
             <wp:docPr id="12" name="Picture 12"/>
             <wp:cNvGraphicFramePr>
               <a:graphicFrameLocks noChangeAspect="1"/>
@@ -2482,7 +2482,7 @@
                   <pic:spPr>
                     <a:xfrm>
                       <a:off x="0" y="0"/>
-                      <a:ext cx="5303520" cy="2263579"/>
+                      <a:ext cx="5303520" cy="2289766"/>
                     </a:xfrm>
                     <a:prstGeom prst="rect"/>
                   </pic:spPr>
@@ -2506,28 +2506,29 @@
         <w:pStyle w:val="Heading2"/>
       </w:pPr>
       <w:r>
-        <w:t>5.2 Evaluasi Hipotesis Terdaftar H_CORN_01 (Hujan Feb–Apr vs Hasil Jagung)</w:t>
+        <w:t>5.2 Evaluasi Hipotesis Terdaftar H_CORN_01 &amp; Estimasi Ulang Robust</w:t>
       </w:r>
     </w:p>
     <w:p>
       <w:r>
         <w:t>Evaluasi ekonometrika Added-Variable Plot Two-Way FE pada 18 sentra kabupaten (2015–2021, N = 124 observasi):</w:t>
         <w:br/>
-        <w:t>• Effect Size Point Estimate (beta): +0.0368 log points per 1 SD anomali cuaca (+3.68% perubahan hasil panen per standar deviasi presipitasi vegetatif Feb–Apr).</w:t>
+        <w:t>• Model 1 (Baseline OLS TWFE): beta = +0.0368 log points / SD, 95% Webb CI = [-0.0521, +0.1300], Bootstrap SE = 0.0516, MDE (2.8 x SE) = +-0.1444.</w:t>
         <w:br/>
-        <w:t>• Wild Cluster Bootstrap Webb (cluster = kabupaten, 999 bootstrap, seed = 42):</w:t>
+        <w:t>• Model 2 (WLS Bobot Luas Baseline 2015–2017): beta = +0.0395, 95% Webb CI = [-0.0161, +0.0932], Bootstrap SE = 0.0307, MDE = +-0.0859.</w:t>
         <w:br/>
-        <w:t xml:space="preserve">  - Bootstrap Standard Error = 0.0464</w:t>
+        <w:t>• Model 3 (Regresi Robust Huber / RLM): beta = +0.0198, 95% Webb CI = [-0.0292, +0.0709], Bootstrap SE = 0.0273, MDE = +-0.0765.</w:t>
         <w:br/>
-        <w:t xml:space="preserve">  - 95% Confidence Interval Webb = [-0.0521, +0.1300]</w:t>
+        <w:t>• Model 4 (Tanpa Outlier MAD-z P95 Cutoff): beta = +0.0555, 95% Webb CI = [-0.0275, +0.1398], Bootstrap SE = 0.0463, MDE = +-0.1298.</w:t>
         <w:br/>
-        <w:t>• Minimum Detectable Effect (Analytical MDE): +-0.2306 log points pada alpha = 0.05 dan Power = 0.80.</w:t>
         <w:br/>
-        <w:t>• Batas Efek Relevan Agronomis (Transfer Literatur): +-0.0650 log points (Schlenker &amp; Roberts 2009).</w:t>
+        <w:t>Efek yang Dikecualikan oleh Data: beta &lt; -0.0521 atau beta &gt; +0.1300.</w:t>
         <w:br/>
-        <w:t>• Status Evaluasi Resmi: EVIDENCE INSUFFICIENT.</w:t>
+        <w:t>Transfer dari Efek Suhu Literatur: +-0.0650 log points (Schlenker &amp; Roberts 2009).</w:t>
         <w:br/>
-        <w:t xml:space="preserve">  95% CI Wild Bootstrap Webb mencakup efek agronomis yang relevan (+0.0650) sekaligus mencakup efek nol (0.0000). Mengingat MDE panel makro tahunan sangat lebar (+-0.2306 &gt; 0.0650), data observasional makro tidak memiliki daya statistik untuk menarik kesimpulan konfirmatori.</w:t>
+        <w:t>Status Evaluasi Resmi: EVIDENCE INSUFFICIENT.</w:t>
+        <w:br/>
+        <w:t>Pada seluruh spesifikasi di atas, 95% CI Wild Bootstrap Webb melintasi nol dan mencakup rentang transfer efek suhu literatur (+-0.0650). Mengingat MDE panel makro tahunan lebih lebar dari benchmark efek (+-0.1444 &gt; 0.0650), data observasional makro tidak memiliki daya statistik untuk menarik kesimpulan kausal konfirmatori.</w:t>
       </w:r>
     </w:p>
     <w:p>
@@ -2576,7 +2577,7 @@
         <w:spacing w:after="160"/>
       </w:pPr>
       <w:r>
-        <w:t>Gambar 5.3: Added-Variable Plot H_CORN_01 Two-Way FE dengan 95% CI Wild Cluster Bootstrap Webb dan MDE Analitis (Status: Evidence Insufficient).</w:t>
+        <w:t>Gambar 5.3: Added-Variable Plot H_CORN_01 Two-Way FE dengan 95% CI Wild Cluster Bootstrap Webb dan MDE = 2.8 x SE (Status: Evidence Insufficient).</w:t>
       </w:r>
     </w:p>
     <w:p>
@@ -2704,9 +2705,11 @@
     </w:p>
     <w:p>
       <w:r>
-        <w:t>• Depresiasi Titik Embun Malam (Tmin - Tdew): Ketika Tmin - Tdew &lt; 1.0°C, kelembapan malam mendekati saturasi 100%, memicu kondensasi air bebas pada tajuk daun tanaman cabai.</w:t>
+        <w:t>• Depresiasi Titik Embun Malam (Tmin – Tdew): Tmin adalah nilai minimum 24 jam (subuh), sedangkan Tdew adalah rata-rata 24 jam. Sebanyak 40.3% hari mencatat depresiasi negatif (&lt; 0°C) murni akibat ketidaksesuaian rata-rata diurnal, bukan supersaturasi udara. Sebagai pelengkap proksi fajar, kelembapan relatif jam 06 lokal (RH_06h) mencatat persentil 90 sebesar 91.6%.</w:t>
         <w:br/>
-        <w:t>• Persistensi Hari Basah Ekstrem: Evaluasi run length hari berturut-turut di bawah P10 depresiasi embun bulanan dilaporkan murni deskriptif untuk sistem peringatan dini penyakit jamur (IFWC) tanpa menghubungkannya dengan regresi hasil panen.</w:t>
+        <w:t>• Persentil Ambang Batas: P10 seluruh musim tanam terhitung -0.70°C (bervariasi per bulan: -0.81°C Maret s.d. -0.48°C Agustus).</w:t>
+        <w:br/>
+        <w:t>• Persistensi Hari Basah Ekstrem: Run length hari berturut-turut di bawah P10 (hanya menghitung run &gt;= 1 hari) dilaporkan murni deskriptif untuk sistem peringatan dini jamur (IFWC) tanpa regresi terhadap hasil panen.</w:t>
       </w:r>
     </w:p>
     <w:p>
@@ -2718,7 +2721,7 @@
       <w:r>
         <w:drawing>
           <wp:inline xmlns:a="http://schemas.openxmlformats.org/drawingml/2006/main" xmlns:pic="http://schemas.openxmlformats.org/drawingml/2006/picture">
-            <wp:extent cx="5303520" cy="2188494"/>
+            <wp:extent cx="5303520" cy="2305771"/>
             <wp:docPr id="16" name="Picture 16"/>
             <wp:cNvGraphicFramePr>
               <a:graphicFrameLocks noChangeAspect="1"/>
@@ -2739,7 +2742,7 @@
                   <pic:spPr>
                     <a:xfrm>
                       <a:off x="0" y="0"/>
-                      <a:ext cx="5303520" cy="2188494"/>
+                      <a:ext cx="5303520" cy="2305771"/>
                     </a:xfrm>
                     <a:prstGeom prst="rect"/>
                   </pic:spPr>
@@ -2755,7 +2758,7 @@
         <w:spacing w:after="160"/>
       </w:pPr>
       <w:r>
-        <w:t>Gambar 5.6: Distribusi Depresiasi Titik Embun Malam (Tmin - Tdew) dan Frekuensi Run Length Hari Lembap Jenuh di Bawah P10 (Tier B Deskriptif).</w:t>
+        <w:t>Gambar 5.6: Distribusi Depresiasi Titik Embun Malam (Tmin – Tdew) dan Frekuensi Run Length Hari Lembap di Bawah P10 (Run &gt;= 1 Hari, Tier B Deskriptif).</w:t>
       </w:r>
     </w:p>
     <w:p>
@@ -2763,18 +2766,18 @@
         <w:pStyle w:val="Heading2"/>
       </w:pPr>
       <w:r>
-        <w:t>5.5 Daya Statistik Analitis (MDE) &amp; Dekomposisi Varians Lintas Komoditas</w:t>
+        <w:t>5.5 Daya Statistik (MDE = 2.8 x SE) &amp; Dekomposisi Varians Lintas Komoditas</w:t>
       </w:r>
     </w:p>
     <w:p>
       <w:r>
-        <w:t>Tabel komparasi MDE analitis dihitung langsung dari rumus varians residual:</w:t>
+        <w:t>Tabel komparasi MDE dihitung konsisten langsung dari Standard Error Wild Cluster Bootstrap (MDE = 2.8 x SE):</w:t>
         <w:br/>
-        <w:t>• Jagung (DS05, T=7, N=124): MDE = +-0.2306 (Underpowered, MDE 23.1% &gt; Efek Agronomis 6.5%).</w:t>
+        <w:t>• Jagung (DS05, T=7, N=124): Bootstrap SE = 0.0516, MDE = +-0.1444 (Daya Rendah, MDE 14.4% &gt; Efek Suhu 6.5%).</w:t>
         <w:br/>
-        <w:t>• Kedelai (DS07, T=7, N=108): MDE = +-0.1842 (Underpowered, MDE 18.4%).</w:t>
+        <w:t>• Kedelai (DS07, T=7, N=108): Bootstrap SE = 0.0503, MDE = +-0.1408 (Daya Rendah, MDE 14.1%).</w:t>
         <w:br/>
-        <w:t>• Padi Sawah (DS03, T=3, N=54): MDE = +-0.0325 (PERINGATAN: Degrees of freedom sempit df=33, bukan daya statistik tinggi).</w:t>
+        <w:t>• Padi Sawah (DS03, T=3, N=54): Bootstrap SE = 0.0163, MDE = +-0.0457 (PERINGATAN: Degrees of freedom sedikit df=33, bukan daya statistik tinggi!).</w:t>
         <w:br/>
         <w:br/>
         <w:t>Dekomposisi varians Two-Way FE:</w:t>
@@ -2783,7 +2786,7 @@
         <w:br/>
         <w:t>• Kedelai: FE Kabupaten = 58.4%, FE Tahun = 8.2%, Residu setelah FE = 33.4%.</w:t>
         <w:br/>
-        <w:t>Komponen residu setelah FE diberi label jujur sebagai gabungan cuaca lokal, noise acak, dan kesalahan ukur lapangan.</w:t>
+        <w:t>Komponen residu setelah FE diberi label jujur sebagai gabungan cuaca lokal, noise acak, dan variasi non-iklim.</w:t>
       </w:r>
     </w:p>
     <w:p>
@@ -2795,7 +2798,7 @@
       <w:r>
         <w:drawing>
           <wp:inline xmlns:a="http://schemas.openxmlformats.org/drawingml/2006/main" xmlns:pic="http://schemas.openxmlformats.org/drawingml/2006/picture">
-            <wp:extent cx="5303520" cy="2906579"/>
+            <wp:extent cx="5303520" cy="2692996"/>
             <wp:docPr id="17" name="Picture 17"/>
             <wp:cNvGraphicFramePr>
               <a:graphicFrameLocks noChangeAspect="1"/>
@@ -2816,7 +2819,7 @@
                   <pic:spPr>
                     <a:xfrm>
                       <a:off x="0" y="0"/>
-                      <a:ext cx="5303520" cy="2906579"/>
+                      <a:ext cx="5303520" cy="2692996"/>
                     </a:xfrm>
                     <a:prstGeom prst="rect"/>
                   </pic:spPr>
@@ -3107,7 +3110,7 @@
               <w:rPr>
                 <w:sz w:val="16"/>
               </w:rPr>
-              <w:t>Periode 2018-2020 UNVERIFIED; 2019 terdistorsi artefak dinas (+21.8%). Panel T=3 menyerap variasi dalam-kabupaten (Within-CV=2.14%). df=33 sempit. Advisory dibangun murni di atas Model Mekanistik Biofisik (Crop Calendar + GDD + Evapotranspirasi ET0).</w:t>
+              <w:t>Periode 2018-2020 UNVERIFIED; 2019 terdistorsi artefak administratif serentak (sawah +23%, ladang +55%), penyebab belum diketahui. Panel T=3 menyerap variasi dalam-kabupaten (Within-CV=2.14%). df=33 sempit. Advisory dibangun murni di atas Model Mekanistik Biofisik (Crop Calendar + GDD + Evapotranspirasi ET0).</w:t>
             </w:r>
           </w:p>
         </w:tc>
@@ -3206,7 +3209,7 @@
               <w:rPr>
                 <w:sz w:val="16"/>
               </w:rPr>
-              <w:t>Tahun 2022 dieksklusikan (imputasi seragam 75.70 ku/ha). Panel 2015-2021 memiliki integritas penuh. Status: Evidence Insufficient (Webb CI melintasi nol). Digunakan untuk uji sensitivitas iklim makro dan kalender tanam.</w:t>
+              <w:t>Tahun 2022 dieksklusikan (imputasi seragam 75.70 ku/ha). Panel 2015-2021 terdaftar ex-ante (dengan pengujian outlier eksplisit). MDE (2.8 x SE) = +-0.1444. Status: Evidence Insufficient (Webb CI melintasi nol). Digunakan untuk uji sensitivitas iklim makro dan kalender tanam.</w:t>
             </w:r>
           </w:p>
         </w:tc>
@@ -3305,7 +3308,7 @@
               <w:rPr>
                 <w:sz w:val="16"/>
               </w:rPr>
-              <w:t>Kriteria ex-ante N&gt;=6 tahun menyaring 17 sentra aktif. Tahun 2022 dieksklusikan (SD runtuh ke 0.19 ku/ha). MDE = +-0.1842. Berfungsi sebagai pembanding sekunder legum.</w:t>
+              <w:t>Kriteria ex-ante N&gt;=6 tahun menyaring 17 sentra aktif. Tahun 2022 dieksklusikan (SD runtuh ke 0.19 ku/ha). MDE (2.8 x SE) = +-0.1250. Berfungsi sebagai pembanding sekunder legum.</w:t>
             </w:r>
           </w:p>
         </w:tc>
@@ -3404,7 +3407,7 @@
               <w:rPr>
                 <w:sz w:val="16"/>
               </w:rPr>
-              <w:t>Zero temporal overlap kabupaten vs cuaca. Bebas label OPT. CV provinsi datar (~4-6%). Monitoring difokuskan pada mikroklimat kebasahan daun malam (Tmin - Tdew &lt; P10) untuk sistem peringatan dini jamur (IFWC).</w:t>
+              <w:t>Zero temporal overlap kabupaten vs cuaca. Bebas label OPT. CV provinsi datar (~4-6%). Monitoring difokuskan pada mikroklimat kebasahan daun malam (persentil P10 depresiasi embun &amp; proksi fajar RH 06h) untuk sistem peringatan dini jamur (IFWC).</w:t>
             </w:r>
           </w:p>
         </w:tc>

</xml_diff>